<commit_message>
Add New mapping file and change some zoom in bug
</commit_message>
<xml_diff>
--- a/aoi_trace_viewer tutorial.docx
+++ b/aoi_trace_viewer tutorial.docx
@@ -3490,11 +3490,6 @@
       </w:r>
     </w:p>
     <w:p>
-      <w:pPr>
-        <w:rPr>
-          <w:rFonts w:hint="eastAsia"/>
-        </w:rPr>
-      </w:pPr>
       <w:r>
         <w:rPr>
           <w:rFonts w:hint="eastAsia"/>
@@ -4701,6 +4696,10 @@
     <w:p>
       <w:pPr>
         <w:pStyle w:val="Web"/>
+        <w:spacing w:after="0" w:afterAutospacing="0"/>
+        <w:rPr>
+          <w:rFonts w:hint="eastAsia"/>
+        </w:rPr>
       </w:pPr>
       <w:r>
         <w:rPr>
@@ -4708,10 +4707,10 @@
         </w:rPr>
         <w:lastRenderedPageBreak/>
         <w:drawing>
-          <wp:inline distT="0" distB="0" distL="0" distR="0" wp14:anchorId="002E34C1" wp14:editId="54EA3EDE">
-            <wp:extent cx="5759450" cy="3240405"/>
-            <wp:effectExtent l="0" t="0" r="0" b="0"/>
-            <wp:docPr id="680451780" name="圖片 6"/>
+          <wp:inline distT="0" distB="0" distL="0" distR="0" wp14:anchorId="35A98E18" wp14:editId="1681E18F">
+            <wp:extent cx="5727622" cy="3222498"/>
+            <wp:effectExtent l="0" t="0" r="6985" b="0"/>
+            <wp:docPr id="947744764" name="圖片 3"/>
             <wp:cNvGraphicFramePr>
               <a:graphicFrameLocks xmlns:a="http://schemas.openxmlformats.org/drawingml/2006/main" noChangeAspect="1"/>
             </wp:cNvGraphicFramePr>
@@ -4719,7 +4718,7 @@
               <a:graphicData uri="http://schemas.openxmlformats.org/drawingml/2006/picture">
                 <pic:pic xmlns:pic="http://schemas.openxmlformats.org/drawingml/2006/picture">
                   <pic:nvPicPr>
-                    <pic:cNvPr id="0" name="Picture 7"/>
+                    <pic:cNvPr id="0" name="Picture 1"/>
                     <pic:cNvPicPr>
                       <a:picLocks noChangeAspect="1" noChangeArrowheads="1"/>
                     </pic:cNvPicPr>
@@ -4740,7 +4739,7 @@
                   <pic:spPr bwMode="auto">
                     <a:xfrm>
                       <a:off x="0" y="0"/>
-                      <a:ext cx="5759450" cy="3240405"/>
+                      <a:ext cx="5732310" cy="3225135"/>
                     </a:xfrm>
                     <a:prstGeom prst="rect">
                       <a:avLst/>
@@ -5879,6 +5878,7 @@
           <w:ilvl w:val="0"/>
           <w:numId w:val="17"/>
         </w:numPr>
+        <w:spacing w:after="0" w:afterAutospacing="0"/>
         <w:rPr>
           <w:rFonts w:ascii="Times New Roman" w:hAnsi="Times New Roman" w:cs="Times New Roman"/>
         </w:rPr>
@@ -5903,7 +5903,107 @@
         <w:rPr>
           <w:rFonts w:ascii="Times New Roman" w:hAnsi="Times New Roman" w:cs="Times New Roman"/>
         </w:rPr>
-        <w:t>displays the read-only Current Fitted States table (sorted means S0 to Sk-1).</w:t>
+        <w:t>displays the read-only Current Fitted States table (sorted means S0 to Sk-1)</w:t>
+      </w:r>
+      <w:r>
+        <w:rPr>
+          <w:rFonts w:ascii="Times New Roman" w:hAnsi="Times New Roman" w:cs="Times New Roman" w:hint="eastAsia"/>
+        </w:rPr>
+        <w:t xml:space="preserve"> and the </w:t>
+      </w:r>
+      <w:r>
+        <w:rPr>
+          <w:rFonts w:ascii="Times New Roman" w:hAnsi="Times New Roman" w:cs="Times New Roman" w:hint="eastAsia"/>
+          <w:b/>
+          <w:bCs/>
+        </w:rPr>
+        <w:t>Merge States</w:t>
+      </w:r>
+      <w:r>
+        <w:rPr>
+          <w:rFonts w:ascii="Times New Roman" w:hAnsi="Times New Roman" w:cs="Times New Roman" w:hint="eastAsia"/>
+        </w:rPr>
+        <w:t xml:space="preserve"> function</w:t>
+      </w:r>
+      <w:r>
+        <w:rPr>
+          <w:rFonts w:ascii="Times New Roman" w:hAnsi="Times New Roman" w:cs="Times New Roman"/>
+        </w:rPr>
+        <w:t>.</w:t>
+      </w:r>
+    </w:p>
+    <w:p>
+      <w:pPr>
+        <w:pStyle w:val="Web"/>
+        <w:numPr>
+          <w:ilvl w:val="0"/>
+          <w:numId w:val="39"/>
+        </w:numPr>
+        <w:spacing w:before="0" w:beforeAutospacing="0"/>
+        <w:rPr>
+          <w:rFonts w:ascii="Times New Roman" w:hAnsi="Times New Roman" w:cs="Times New Roman"/>
+        </w:rPr>
+      </w:pPr>
+      <w:r>
+        <w:rPr>
+          <w:rFonts w:ascii="Times New Roman" w:hAnsi="Times New Roman" w:cs="Times New Roman"/>
+          <w:b/>
+          <w:bCs/>
+        </w:rPr>
+        <w:t>Merge threshold</w:t>
+      </w:r>
+      <w:r>
+        <w:rPr>
+          <w:rFonts w:ascii="Times New Roman" w:hAnsi="Times New Roman" w:cs="Times New Roman" w:hint="eastAsia"/>
+          <w:b/>
+          <w:bCs/>
+        </w:rPr>
+        <w:t>:</w:t>
+      </w:r>
+      <w:r>
+        <w:rPr>
+          <w:rFonts w:ascii="Times New Roman" w:hAnsi="Times New Roman" w:cs="Times New Roman" w:hint="eastAsia"/>
+        </w:rPr>
+        <w:t xml:space="preserve"> </w:t>
+      </w:r>
+      <w:r>
+        <w:rPr>
+          <w:rFonts w:ascii="Times New Roman" w:hAnsi="Times New Roman" w:cs="Times New Roman"/>
+        </w:rPr>
+        <w:t>sets the maximum absolute difference between two fitted state means for them to be considered the same state.</w:t>
+      </w:r>
+    </w:p>
+    <w:p>
+      <w:pPr>
+        <w:pStyle w:val="Web"/>
+        <w:numPr>
+          <w:ilvl w:val="0"/>
+          <w:numId w:val="39"/>
+        </w:numPr>
+        <w:spacing w:before="0" w:beforeAutospacing="0"/>
+        <w:rPr>
+          <w:rFonts w:ascii="Times New Roman" w:hAnsi="Times New Roman" w:cs="Times New Roman"/>
+        </w:rPr>
+      </w:pPr>
+      <w:r>
+        <w:rPr>
+          <w:rFonts w:ascii="Times New Roman" w:hAnsi="Times New Roman" w:cs="Times New Roman"/>
+          <w:b/>
+          <w:bCs/>
+        </w:rPr>
+        <w:t>Merge States</w:t>
+      </w:r>
+      <w:r>
+        <w:rPr>
+          <w:rFonts w:ascii="Times New Roman" w:hAnsi="Times New Roman" w:cs="Times New Roman" w:hint="eastAsia"/>
+        </w:rPr>
+        <w:t xml:space="preserve"> button: </w:t>
+      </w:r>
+      <w:r>
+        <w:rPr>
+          <w:rFonts w:ascii="Times New Roman" w:hAnsi="Times New Roman" w:cs="Times New Roman"/>
+        </w:rPr>
+        <w:t>after clicking, states whose means fall within the threshold are collapsed into one (averaged mean, remapped indices).</w:t>
       </w:r>
     </w:p>
     <w:p>
@@ -6017,9 +6117,9 @@
         </w:rPr>
         <w:lastRenderedPageBreak/>
         <w:drawing>
-          <wp:inline distT="0" distB="0" distL="0" distR="0" wp14:anchorId="477F0F11" wp14:editId="0209BE8E">
-            <wp:extent cx="5759346" cy="2126120"/>
-            <wp:effectExtent l="0" t="0" r="0" b="7620"/>
+          <wp:inline distT="0" distB="0" distL="0" distR="0" wp14:anchorId="477F0F11" wp14:editId="74ECCEE8">
+            <wp:extent cx="5758727" cy="1806360"/>
+            <wp:effectExtent l="0" t="0" r="0" b="3810"/>
             <wp:docPr id="845018439" name="圖片 8"/>
             <wp:cNvGraphicFramePr>
               <a:graphicFrameLocks xmlns:a="http://schemas.openxmlformats.org/drawingml/2006/main" noChangeAspect="1"/>
@@ -6041,7 +6141,7 @@
                         </a:ext>
                       </a:extLst>
                     </a:blip>
-                    <a:srcRect t="14719" b="19654"/>
+                    <a:srcRect t="20087" b="24150"/>
                     <a:stretch>
                       <a:fillRect/>
                     </a:stretch>
@@ -6049,7 +6149,7 @@
                   <pic:spPr bwMode="auto">
                     <a:xfrm>
                       <a:off x="0" y="0"/>
-                      <a:ext cx="5759450" cy="2126158"/>
+                      <a:ext cx="5759450" cy="1806587"/>
                     </a:xfrm>
                     <a:prstGeom prst="rect">
                       <a:avLst/>
@@ -6256,7 +6356,7 @@
         </w:numPr>
         <w:spacing w:before="0" w:beforeAutospacing="0" w:after="0" w:afterAutospacing="0"/>
         <w:rPr>
-          <w:rFonts w:ascii="Times New Roman" w:hAnsi="Times New Roman" w:cs="Times New Roman" w:hint="eastAsia"/>
+          <w:rFonts w:ascii="Times New Roman" w:hAnsi="Times New Roman" w:cs="Times New Roman"/>
         </w:rPr>
       </w:pPr>
       <w:r>
@@ -8802,6 +8902,119 @@
     </w:lvl>
   </w:abstractNum>
   <w:abstractNum w:abstractNumId="22" w15:restartNumberingAfterBreak="0">
+    <w:nsid w:val="30ED3474"/>
+    <w:multiLevelType w:val="hybridMultilevel"/>
+    <w:tmpl w:val="E7D0D41A"/>
+    <w:lvl w:ilvl="0" w:tplc="0409000B">
+      <w:start w:val="1"/>
+      <w:numFmt w:val="bullet"/>
+      <w:lvlText w:val=""/>
+      <w:lvlJc w:val="left"/>
+      <w:pPr>
+        <w:ind w:left="480" w:hanging="480"/>
+      </w:pPr>
+      <w:rPr>
+        <w:rFonts w:ascii="Wingdings" w:hAnsi="Wingdings" w:hint="default"/>
+      </w:rPr>
+    </w:lvl>
+    <w:lvl w:ilvl="1" w:tplc="04090003" w:tentative="1">
+      <w:start w:val="1"/>
+      <w:numFmt w:val="bullet"/>
+      <w:lvlText w:val=""/>
+      <w:lvlJc w:val="left"/>
+      <w:pPr>
+        <w:ind w:left="960" w:hanging="480"/>
+      </w:pPr>
+      <w:rPr>
+        <w:rFonts w:ascii="Wingdings" w:hAnsi="Wingdings" w:hint="default"/>
+      </w:rPr>
+    </w:lvl>
+    <w:lvl w:ilvl="2" w:tplc="04090005" w:tentative="1">
+      <w:start w:val="1"/>
+      <w:numFmt w:val="bullet"/>
+      <w:lvlText w:val=""/>
+      <w:lvlJc w:val="left"/>
+      <w:pPr>
+        <w:ind w:left="1440" w:hanging="480"/>
+      </w:pPr>
+      <w:rPr>
+        <w:rFonts w:ascii="Wingdings" w:hAnsi="Wingdings" w:hint="default"/>
+      </w:rPr>
+    </w:lvl>
+    <w:lvl w:ilvl="3" w:tplc="04090001" w:tentative="1">
+      <w:start w:val="1"/>
+      <w:numFmt w:val="bullet"/>
+      <w:lvlText w:val=""/>
+      <w:lvlJc w:val="left"/>
+      <w:pPr>
+        <w:ind w:left="1920" w:hanging="480"/>
+      </w:pPr>
+      <w:rPr>
+        <w:rFonts w:ascii="Wingdings" w:hAnsi="Wingdings" w:hint="default"/>
+      </w:rPr>
+    </w:lvl>
+    <w:lvl w:ilvl="4" w:tplc="04090003" w:tentative="1">
+      <w:start w:val="1"/>
+      <w:numFmt w:val="bullet"/>
+      <w:lvlText w:val=""/>
+      <w:lvlJc w:val="left"/>
+      <w:pPr>
+        <w:ind w:left="2400" w:hanging="480"/>
+      </w:pPr>
+      <w:rPr>
+        <w:rFonts w:ascii="Wingdings" w:hAnsi="Wingdings" w:hint="default"/>
+      </w:rPr>
+    </w:lvl>
+    <w:lvl w:ilvl="5" w:tplc="04090005" w:tentative="1">
+      <w:start w:val="1"/>
+      <w:numFmt w:val="bullet"/>
+      <w:lvlText w:val=""/>
+      <w:lvlJc w:val="left"/>
+      <w:pPr>
+        <w:ind w:left="2880" w:hanging="480"/>
+      </w:pPr>
+      <w:rPr>
+        <w:rFonts w:ascii="Wingdings" w:hAnsi="Wingdings" w:hint="default"/>
+      </w:rPr>
+    </w:lvl>
+    <w:lvl w:ilvl="6" w:tplc="04090001" w:tentative="1">
+      <w:start w:val="1"/>
+      <w:numFmt w:val="bullet"/>
+      <w:lvlText w:val=""/>
+      <w:lvlJc w:val="left"/>
+      <w:pPr>
+        <w:ind w:left="3360" w:hanging="480"/>
+      </w:pPr>
+      <w:rPr>
+        <w:rFonts w:ascii="Wingdings" w:hAnsi="Wingdings" w:hint="default"/>
+      </w:rPr>
+    </w:lvl>
+    <w:lvl w:ilvl="7" w:tplc="04090003" w:tentative="1">
+      <w:start w:val="1"/>
+      <w:numFmt w:val="bullet"/>
+      <w:lvlText w:val=""/>
+      <w:lvlJc w:val="left"/>
+      <w:pPr>
+        <w:ind w:left="3840" w:hanging="480"/>
+      </w:pPr>
+      <w:rPr>
+        <w:rFonts w:ascii="Wingdings" w:hAnsi="Wingdings" w:hint="default"/>
+      </w:rPr>
+    </w:lvl>
+    <w:lvl w:ilvl="8" w:tplc="04090005" w:tentative="1">
+      <w:start w:val="1"/>
+      <w:numFmt w:val="bullet"/>
+      <w:lvlText w:val=""/>
+      <w:lvlJc w:val="left"/>
+      <w:pPr>
+        <w:ind w:left="4320" w:hanging="480"/>
+      </w:pPr>
+      <w:rPr>
+        <w:rFonts w:ascii="Wingdings" w:hAnsi="Wingdings" w:hint="default"/>
+      </w:rPr>
+    </w:lvl>
+  </w:abstractNum>
+  <w:abstractNum w:abstractNumId="23" w15:restartNumberingAfterBreak="0">
     <w:nsid w:val="3D482E76"/>
     <w:multiLevelType w:val="hybridMultilevel"/>
     <w:tmpl w:val="3BA0CD36"/>
@@ -8914,7 +9127,7 @@
       </w:rPr>
     </w:lvl>
   </w:abstractNum>
-  <w:abstractNum w:abstractNumId="23" w15:restartNumberingAfterBreak="0">
+  <w:abstractNum w:abstractNumId="24" w15:restartNumberingAfterBreak="0">
     <w:nsid w:val="410E04B6"/>
     <w:multiLevelType w:val="hybridMultilevel"/>
     <w:tmpl w:val="EBAE2144"/>
@@ -9000,7 +9213,7 @@
       </w:pPr>
     </w:lvl>
   </w:abstractNum>
-  <w:abstractNum w:abstractNumId="24" w15:restartNumberingAfterBreak="0">
+  <w:abstractNum w:abstractNumId="25" w15:restartNumberingAfterBreak="0">
     <w:nsid w:val="421B4BA1"/>
     <w:multiLevelType w:val="hybridMultilevel"/>
     <w:tmpl w:val="510C92D4"/>
@@ -9113,7 +9326,7 @@
       </w:rPr>
     </w:lvl>
   </w:abstractNum>
-  <w:abstractNum w:abstractNumId="25" w15:restartNumberingAfterBreak="0">
+  <w:abstractNum w:abstractNumId="26" w15:restartNumberingAfterBreak="0">
     <w:nsid w:val="47AA792B"/>
     <w:multiLevelType w:val="hybridMultilevel"/>
     <w:tmpl w:val="5B4286F0"/>
@@ -9226,7 +9439,7 @@
       </w:rPr>
     </w:lvl>
   </w:abstractNum>
-  <w:abstractNum w:abstractNumId="26" w15:restartNumberingAfterBreak="0">
+  <w:abstractNum w:abstractNumId="27" w15:restartNumberingAfterBreak="0">
     <w:nsid w:val="47FA0502"/>
     <w:multiLevelType w:val="hybridMultilevel"/>
     <w:tmpl w:val="A0E4B654"/>
@@ -9339,7 +9552,7 @@
       </w:rPr>
     </w:lvl>
   </w:abstractNum>
-  <w:abstractNum w:abstractNumId="27" w15:restartNumberingAfterBreak="0">
+  <w:abstractNum w:abstractNumId="28" w15:restartNumberingAfterBreak="0">
     <w:nsid w:val="48D9021A"/>
     <w:multiLevelType w:val="hybridMultilevel"/>
     <w:tmpl w:val="9484122E"/>
@@ -9452,7 +9665,7 @@
       </w:rPr>
     </w:lvl>
   </w:abstractNum>
-  <w:abstractNum w:abstractNumId="28" w15:restartNumberingAfterBreak="0">
+  <w:abstractNum w:abstractNumId="29" w15:restartNumberingAfterBreak="0">
     <w:nsid w:val="4D7D036F"/>
     <w:multiLevelType w:val="hybridMultilevel"/>
     <w:tmpl w:val="166A2646"/>
@@ -9565,7 +9778,7 @@
       </w:rPr>
     </w:lvl>
   </w:abstractNum>
-  <w:abstractNum w:abstractNumId="29" w15:restartNumberingAfterBreak="0">
+  <w:abstractNum w:abstractNumId="30" w15:restartNumberingAfterBreak="0">
     <w:nsid w:val="558B779A"/>
     <w:multiLevelType w:val="hybridMultilevel"/>
     <w:tmpl w:val="46325036"/>
@@ -9656,7 +9869,7 @@
       </w:pPr>
     </w:lvl>
   </w:abstractNum>
-  <w:abstractNum w:abstractNumId="30" w15:restartNumberingAfterBreak="0">
+  <w:abstractNum w:abstractNumId="31" w15:restartNumberingAfterBreak="0">
     <w:nsid w:val="5FFD333F"/>
     <w:multiLevelType w:val="hybridMultilevel"/>
     <w:tmpl w:val="25E88ABE"/>
@@ -9769,7 +9982,7 @@
       </w:rPr>
     </w:lvl>
   </w:abstractNum>
-  <w:abstractNum w:abstractNumId="31" w15:restartNumberingAfterBreak="0">
+  <w:abstractNum w:abstractNumId="32" w15:restartNumberingAfterBreak="0">
     <w:nsid w:val="60DE7186"/>
     <w:multiLevelType w:val="hybridMultilevel"/>
     <w:tmpl w:val="C7EC3740"/>
@@ -9855,7 +10068,7 @@
       </w:pPr>
     </w:lvl>
   </w:abstractNum>
-  <w:abstractNum w:abstractNumId="32" w15:restartNumberingAfterBreak="0">
+  <w:abstractNum w:abstractNumId="33" w15:restartNumberingAfterBreak="0">
     <w:nsid w:val="65AC31E5"/>
     <w:multiLevelType w:val="hybridMultilevel"/>
     <w:tmpl w:val="9D7C15C0"/>
@@ -9941,7 +10154,7 @@
       </w:pPr>
     </w:lvl>
   </w:abstractNum>
-  <w:abstractNum w:abstractNumId="33" w15:restartNumberingAfterBreak="0">
+  <w:abstractNum w:abstractNumId="34" w15:restartNumberingAfterBreak="0">
     <w:nsid w:val="672C4E99"/>
     <w:multiLevelType w:val="hybridMultilevel"/>
     <w:tmpl w:val="FF200908"/>
@@ -10054,7 +10267,7 @@
       </w:rPr>
     </w:lvl>
   </w:abstractNum>
-  <w:abstractNum w:abstractNumId="34" w15:restartNumberingAfterBreak="0">
+  <w:abstractNum w:abstractNumId="35" w15:restartNumberingAfterBreak="0">
     <w:nsid w:val="6CD46012"/>
     <w:multiLevelType w:val="hybridMultilevel"/>
     <w:tmpl w:val="CC0682DC"/>
@@ -10143,7 +10356,7 @@
       </w:pPr>
     </w:lvl>
   </w:abstractNum>
-  <w:abstractNum w:abstractNumId="35" w15:restartNumberingAfterBreak="0">
+  <w:abstractNum w:abstractNumId="36" w15:restartNumberingAfterBreak="0">
     <w:nsid w:val="6EB9019F"/>
     <w:multiLevelType w:val="hybridMultilevel"/>
     <w:tmpl w:val="98E619AE"/>
@@ -10229,7 +10442,7 @@
       </w:pPr>
     </w:lvl>
   </w:abstractNum>
-  <w:abstractNum w:abstractNumId="36" w15:restartNumberingAfterBreak="0">
+  <w:abstractNum w:abstractNumId="37" w15:restartNumberingAfterBreak="0">
     <w:nsid w:val="7109288E"/>
     <w:multiLevelType w:val="hybridMultilevel"/>
     <w:tmpl w:val="3448FD7C"/>
@@ -10342,7 +10555,7 @@
       </w:rPr>
     </w:lvl>
   </w:abstractNum>
-  <w:abstractNum w:abstractNumId="37" w15:restartNumberingAfterBreak="0">
+  <w:abstractNum w:abstractNumId="38" w15:restartNumberingAfterBreak="0">
     <w:nsid w:val="7DB1550A"/>
     <w:multiLevelType w:val="hybridMultilevel"/>
     <w:tmpl w:val="C218C8EA"/>
@@ -10456,7 +10669,7 @@
     </w:lvl>
   </w:abstractNum>
   <w:num w:numId="1" w16cid:durableId="1107964870">
-    <w:abstractNumId w:val="35"/>
+    <w:abstractNumId w:val="36"/>
   </w:num>
   <w:num w:numId="2" w16cid:durableId="543444446">
     <w:abstractNumId w:val="17"/>
@@ -10465,13 +10678,13 @@
     <w:abstractNumId w:val="19"/>
   </w:num>
   <w:num w:numId="4" w16cid:durableId="717125743">
-    <w:abstractNumId w:val="28"/>
+    <w:abstractNumId w:val="29"/>
   </w:num>
   <w:num w:numId="5" w16cid:durableId="2048557030">
-    <w:abstractNumId w:val="33"/>
+    <w:abstractNumId w:val="34"/>
   </w:num>
   <w:num w:numId="6" w16cid:durableId="27611549">
-    <w:abstractNumId w:val="30"/>
+    <w:abstractNumId w:val="31"/>
   </w:num>
   <w:num w:numId="7" w16cid:durableId="115804199">
     <w:abstractNumId w:val="0"/>
@@ -10480,22 +10693,22 @@
     <w:abstractNumId w:val="2"/>
   </w:num>
   <w:num w:numId="9" w16cid:durableId="576282406">
-    <w:abstractNumId w:val="34"/>
+    <w:abstractNumId w:val="35"/>
   </w:num>
   <w:num w:numId="10" w16cid:durableId="1975793468">
-    <w:abstractNumId w:val="22"/>
+    <w:abstractNumId w:val="23"/>
   </w:num>
   <w:num w:numId="11" w16cid:durableId="1272008842">
     <w:abstractNumId w:val="7"/>
   </w:num>
   <w:num w:numId="12" w16cid:durableId="758136301">
-    <w:abstractNumId w:val="31"/>
+    <w:abstractNumId w:val="32"/>
   </w:num>
   <w:num w:numId="13" w16cid:durableId="56056473">
-    <w:abstractNumId w:val="32"/>
+    <w:abstractNumId w:val="33"/>
   </w:num>
   <w:num w:numId="14" w16cid:durableId="381442925">
-    <w:abstractNumId w:val="23"/>
+    <w:abstractNumId w:val="24"/>
   </w:num>
   <w:num w:numId="15" w16cid:durableId="1850829547">
     <w:abstractNumId w:val="11"/>
@@ -10504,7 +10717,7 @@
     <w:abstractNumId w:val="20"/>
   </w:num>
   <w:num w:numId="17" w16cid:durableId="446583886">
-    <w:abstractNumId w:val="29"/>
+    <w:abstractNumId w:val="30"/>
   </w:num>
   <w:num w:numId="18" w16cid:durableId="590628015">
     <w:abstractNumId w:val="14"/>
@@ -10519,7 +10732,7 @@
     <w:abstractNumId w:val="3"/>
   </w:num>
   <w:num w:numId="22" w16cid:durableId="1920940440">
-    <w:abstractNumId w:val="27"/>
+    <w:abstractNumId w:val="28"/>
   </w:num>
   <w:num w:numId="23" w16cid:durableId="17397248">
     <w:abstractNumId w:val="18"/>
@@ -10531,7 +10744,7 @@
     <w:abstractNumId w:val="12"/>
   </w:num>
   <w:num w:numId="26" w16cid:durableId="40789570">
-    <w:abstractNumId w:val="25"/>
+    <w:abstractNumId w:val="26"/>
   </w:num>
   <w:num w:numId="27" w16cid:durableId="1819298073">
     <w:abstractNumId w:val="10"/>
@@ -10543,10 +10756,10 @@
     <w:abstractNumId w:val="9"/>
   </w:num>
   <w:num w:numId="30" w16cid:durableId="1735855696">
-    <w:abstractNumId w:val="26"/>
+    <w:abstractNumId w:val="27"/>
   </w:num>
   <w:num w:numId="31" w16cid:durableId="1612317273">
-    <w:abstractNumId w:val="24"/>
+    <w:abstractNumId w:val="25"/>
   </w:num>
   <w:num w:numId="32" w16cid:durableId="16153978">
     <w:abstractNumId w:val="4"/>
@@ -10555,7 +10768,7 @@
     <w:abstractNumId w:val="21"/>
   </w:num>
   <w:num w:numId="34" w16cid:durableId="746616909">
-    <w:abstractNumId w:val="37"/>
+    <w:abstractNumId w:val="38"/>
   </w:num>
   <w:num w:numId="35" w16cid:durableId="627197994">
     <w:abstractNumId w:val="15"/>
@@ -10564,10 +10777,13 @@
     <w:abstractNumId w:val="16"/>
   </w:num>
   <w:num w:numId="37" w16cid:durableId="966007311">
-    <w:abstractNumId w:val="36"/>
+    <w:abstractNumId w:val="37"/>
   </w:num>
   <w:num w:numId="38" w16cid:durableId="1225917163">
     <w:abstractNumId w:val="8"/>
+  </w:num>
+  <w:num w:numId="39" w16cid:durableId="1009604231">
+    <w:abstractNumId w:val="22"/>
   </w:num>
 </w:numbering>
 </file>

</xml_diff>

<commit_message>
repair calculated drift error
</commit_message>
<xml_diff>
--- a/aoi_trace_viewer tutorial.docx
+++ b/aoi_trace_viewer tutorial.docx
@@ -259,21 +259,7 @@
         <w:rPr>
           <w:rFonts w:cs="Times New Roman"/>
         </w:rPr>
-        <w:t xml:space="preserve"> file on your Desktop. A webpage and a command prompt (</w:t>
-      </w:r>
-      <w:proofErr w:type="spellStart"/>
-      <w:r>
-        <w:rPr>
-          <w:rFonts w:cs="Times New Roman"/>
-        </w:rPr>
-        <w:t>cmd</w:t>
-      </w:r>
-      <w:proofErr w:type="spellEnd"/>
-      <w:r>
-        <w:rPr>
-          <w:rFonts w:cs="Times New Roman"/>
-        </w:rPr>
-        <w:t>) window will open. Wait until the command prompt displays a rocket icon, then press F5 to refresh the webpage.</w:t>
+        <w:t xml:space="preserve"> file on your Desktop. A webpage and a command prompt (cmd) window will open. Wait until the command prompt displays a rocket icon, then press F5 to refresh the webpage.</w:t>
       </w:r>
       <w:r>
         <w:rPr>
@@ -676,19 +662,11 @@
           <w:rFonts w:cs="Times New Roman"/>
         </w:rPr>
       </w:pPr>
-      <w:proofErr w:type="spellStart"/>
-      <w:r>
-        <w:rPr>
-          <w:rFonts w:cs="Times New Roman"/>
-        </w:rPr>
-        <w:t>Thres</w:t>
-      </w:r>
-      <w:proofErr w:type="spellEnd"/>
-      <w:r>
-        <w:rPr>
-          <w:rFonts w:cs="Times New Roman"/>
-        </w:rPr>
-        <w:t xml:space="preserve"> (Threshold): Sets the spot-selection criteria. AOIs below this threshold are excluded. Increase this value if too much non-signal background is selected (usually 7 for 512x512, and 15 for 1024x1024).</w:t>
+      <w:r>
+        <w:rPr>
+          <w:rFonts w:cs="Times New Roman"/>
+        </w:rPr>
+        <w:t>Thres (Threshold): Sets the spot-selection criteria. AOIs below this threshold are excluded. Increase this value if too much non-signal background is selected (usually 7 for 512x512, and 15 for 1024x1024).</w:t>
       </w:r>
     </w:p>
     <w:p>
@@ -733,21 +711,7 @@
         <w:rPr>
           <w:rFonts w:cs="Times New Roman"/>
         </w:rPr>
-        <w:t xml:space="preserve">Ratio: Sets the criterion for spot shape using Otsu and </w:t>
-      </w:r>
-      <w:proofErr w:type="spellStart"/>
-      <w:r>
-        <w:rPr>
-          <w:rFonts w:cs="Times New Roman"/>
-        </w:rPr>
-        <w:t>skimage</w:t>
-      </w:r>
-      <w:proofErr w:type="spellEnd"/>
-      <w:r>
-        <w:rPr>
-          <w:rFonts w:cs="Times New Roman"/>
-        </w:rPr>
-        <w:t xml:space="preserve"> algorithms. If the blob's major axis divided by its minor axis is greater than this ratio, the spot is excluded.</w:t>
+        <w:t>Ratio: Sets the criterion for spot shape using Otsu and skimage algorithms. If the blob's major axis divided by its minor axis is greater than this ratio, the spot is excluded.</w:t>
       </w:r>
     </w:p>
     <w:p>
@@ -781,19 +745,11 @@
           <w:rFonts w:cs="Times New Roman"/>
         </w:rPr>
       </w:pPr>
-      <w:proofErr w:type="spellStart"/>
-      <w:r>
-        <w:rPr>
-          <w:rFonts w:cs="Times New Roman"/>
-        </w:rPr>
-        <w:t>Min_D</w:t>
-      </w:r>
-      <w:proofErr w:type="spellEnd"/>
-      <w:r>
-        <w:rPr>
-          <w:rFonts w:cs="Times New Roman"/>
-        </w:rPr>
-        <w:t>: The minimum allowable distance between blobs. If two blobs are closer than this value, both are excluded. 9 is recommended.</w:t>
+      <w:r>
+        <w:rPr>
+          <w:rFonts w:cs="Times New Roman"/>
+        </w:rPr>
+        <w:t>Min_D: The minimum allowable distance between blobs. If two blobs are closer than this value, both are excluded. 9 is recommended.</w:t>
       </w:r>
     </w:p>
     <w:p>
@@ -831,21 +787,7 @@
         <w:rPr>
           <w:rFonts w:cs="Times New Roman"/>
         </w:rPr>
-        <w:t xml:space="preserve">Range: Adjusts the image contrast. Use the </w:t>
-      </w:r>
-      <w:proofErr w:type="spellStart"/>
-      <w:r>
-        <w:rPr>
-          <w:rFonts w:cs="Times New Roman"/>
-        </w:rPr>
-        <w:t>Autoscale</w:t>
-      </w:r>
-      <w:proofErr w:type="spellEnd"/>
-      <w:r>
-        <w:rPr>
-          <w:rFonts w:cs="Times New Roman"/>
-        </w:rPr>
-        <w:t xml:space="preserve"> button to set the minimum and maximum automatically, then manually adjust the maximum so the blobs are clearly visible without significant visual overflow.</w:t>
+        <w:t>Range: Adjusts the image contrast. Use the Autoscale button to set the minimum and maximum automatically, then manually adjust the maximum so the blobs are clearly visible without significant visual overflow.</w:t>
       </w:r>
     </w:p>
     <w:p>
@@ -1251,35 +1193,7 @@
         <w:rPr>
           <w:rFonts w:cs="Times New Roman"/>
         </w:rPr>
-        <w:t>, you will see that two new folders (circled and raw) and two new files (</w:t>
-      </w:r>
-      <w:proofErr w:type="spellStart"/>
-      <w:r>
-        <w:rPr>
-          <w:rFonts w:cs="Times New Roman"/>
-        </w:rPr>
-        <w:t>blobs.npz</w:t>
-      </w:r>
-      <w:proofErr w:type="spellEnd"/>
-      <w:r>
-        <w:rPr>
-          <w:rFonts w:cs="Times New Roman"/>
-        </w:rPr>
-        <w:t xml:space="preserve"> and </w:t>
-      </w:r>
-      <w:proofErr w:type="spellStart"/>
-      <w:r>
-        <w:rPr>
-          <w:rFonts w:cs="Times New Roman"/>
-        </w:rPr>
-        <w:t>dcombined_image.npy</w:t>
-      </w:r>
-      <w:proofErr w:type="spellEnd"/>
-      <w:r>
-        <w:rPr>
-          <w:rFonts w:cs="Times New Roman"/>
-        </w:rPr>
-        <w:t>) have been added to your directory.</w:t>
+        <w:t>, you will see that two new folders (circled and raw) and two new files (blobs.npz and dcombined_image.npy) have been added to your directory.</w:t>
       </w:r>
     </w:p>
     <w:p>
@@ -1355,7 +1269,31 @@
         <w:rPr>
           <w:rFonts w:cs="Times New Roman"/>
         </w:rPr>
-        <w:t xml:space="preserve"> (maximum distance for centers to be considered the same point).</w:t>
+        <w:t xml:space="preserve"> (maximum distance</w:t>
+      </w:r>
+      <w:r>
+        <w:rPr>
+          <w:rFonts w:cs="Times New Roman" w:hint="eastAsia"/>
+        </w:rPr>
+        <w:t xml:space="preserve"> (index)</w:t>
+      </w:r>
+      <w:r>
+        <w:rPr>
+          <w:rFonts w:cs="Times New Roman"/>
+        </w:rPr>
+        <w:t xml:space="preserve"> for centers to be considered the same point</w:t>
+      </w:r>
+      <w:r>
+        <w:rPr>
+          <w:rFonts w:cs="Times New Roman" w:hint="eastAsia"/>
+        </w:rPr>
+        <w:t xml:space="preserve"> after drift</w:t>
+      </w:r>
+      <w:r>
+        <w:rPr>
+          <w:rFonts w:cs="Times New Roman"/>
+        </w:rPr>
+        <w:t>).</w:t>
       </w:r>
     </w:p>
     <w:p>
@@ -1527,35 +1465,7 @@
         <w:rPr>
           <w:rFonts w:cs="Times New Roman"/>
         </w:rPr>
-        <w:t xml:space="preserve">If you already have </w:t>
-      </w:r>
-      <w:proofErr w:type="spellStart"/>
-      <w:r>
-        <w:rPr>
-          <w:rFonts w:cs="Times New Roman"/>
-        </w:rPr>
-        <w:t>selected_g</w:t>
-      </w:r>
-      <w:proofErr w:type="spellEnd"/>
-      <w:r>
-        <w:rPr>
-          <w:rFonts w:cs="Times New Roman"/>
-        </w:rPr>
-        <w:t xml:space="preserve"> and </w:t>
-      </w:r>
-      <w:proofErr w:type="spellStart"/>
-      <w:r>
-        <w:rPr>
-          <w:rFonts w:cs="Times New Roman"/>
-        </w:rPr>
-        <w:t>selected_b</w:t>
-      </w:r>
-      <w:proofErr w:type="spellEnd"/>
-      <w:r>
-        <w:rPr>
-          <w:rFonts w:cs="Times New Roman"/>
-        </w:rPr>
-        <w:t xml:space="preserve"> annotations that you want to keep, turn on the </w:t>
+        <w:t xml:space="preserve">If you already have selected_g and selected_b annotations that you want to keep, turn on the </w:t>
       </w:r>
       <w:r>
         <w:rPr>
@@ -2227,19 +2137,11 @@
           </wp:anchor>
         </w:drawing>
       </w:r>
-      <w:proofErr w:type="spellStart"/>
-      <w:r>
-        <w:rPr>
-          <w:rFonts w:cs="Times New Roman"/>
-        </w:rPr>
-        <w:t>total_intensity</w:t>
-      </w:r>
-      <w:proofErr w:type="spellEnd"/>
-      <w:r>
-        <w:rPr>
-          <w:rFonts w:cs="Times New Roman"/>
-        </w:rPr>
-        <w:t>: Contains the distribution graphs of the AOIs' intensities.</w:t>
+      <w:r>
+        <w:rPr>
+          <w:rFonts w:cs="Times New Roman"/>
+        </w:rPr>
+        <w:t>total_intensity: Contains the distribution graphs of the AOIs' intensities.</w:t>
       </w:r>
     </w:p>
     <w:p>
@@ -2345,17 +2247,8 @@
           <w:rFonts w:cs="Times New Roman"/>
           <w:b/>
         </w:rPr>
-        <w:t xml:space="preserve">What is </w:t>
-      </w:r>
-      <w:proofErr w:type="spellStart"/>
-      <w:r>
-        <w:rPr>
-          <w:rFonts w:cs="Times New Roman"/>
-          <w:b/>
-        </w:rPr>
-        <w:t>TraceViewer</w:t>
-      </w:r>
-      <w:proofErr w:type="spellEnd"/>
+        <w:t>What is TraceViewer</w:t>
+      </w:r>
     </w:p>
     <w:p>
       <w:pPr>
@@ -2371,39 +2264,7 @@
           <w:rFonts w:cs="Times New Roman"/>
           <w:bCs/>
         </w:rPr>
-        <w:t xml:space="preserve">In brief, </w:t>
-      </w:r>
-      <w:proofErr w:type="spellStart"/>
-      <w:r>
-        <w:rPr>
-          <w:rFonts w:cs="Times New Roman"/>
-          <w:bCs/>
-        </w:rPr>
-        <w:t>TraceViewer</w:t>
-      </w:r>
-      <w:proofErr w:type="spellEnd"/>
-      <w:r>
-        <w:rPr>
-          <w:rFonts w:cs="Times New Roman"/>
-          <w:bCs/>
-        </w:rPr>
-        <w:t xml:space="preserve"> helps user view the </w:t>
-      </w:r>
-      <w:proofErr w:type="spellStart"/>
-      <w:r>
-        <w:rPr>
-          <w:rFonts w:cs="Times New Roman"/>
-          <w:bCs/>
-        </w:rPr>
-        <w:t>data.npz</w:t>
-      </w:r>
-      <w:proofErr w:type="spellEnd"/>
-      <w:r>
-        <w:rPr>
-          <w:rFonts w:cs="Times New Roman"/>
-          <w:bCs/>
-        </w:rPr>
-        <w:t xml:space="preserve"> file output by Aoi viewer. This software also contain breakpoint annotation, rupture detection, gaussian mixture, hmm fitting and blob visualization. </w:t>
+        <w:t xml:space="preserve">In brief, TraceViewer helps user view the data.npz file output by Aoi viewer. This software also contain breakpoint annotation, rupture detection, gaussian mixture, hmm fitting and blob visualization. </w:t>
       </w:r>
     </w:p>
     <w:p>
@@ -2657,39 +2518,7 @@
           <w:rFonts w:cs="Times New Roman"/>
           <w:bCs/>
         </w:rPr>
-        <w:t>To use the Trace Viewer, click the trace_viewer2.0.bat file on your Desktop. A webpage and a command prompt (</w:t>
-      </w:r>
-      <w:proofErr w:type="spellStart"/>
-      <w:r>
-        <w:rPr>
-          <w:rFonts w:cs="Times New Roman"/>
-          <w:bCs/>
-        </w:rPr>
-        <w:t>cmd</w:t>
-      </w:r>
-      <w:proofErr w:type="spellEnd"/>
-      <w:r>
-        <w:rPr>
-          <w:rFonts w:cs="Times New Roman"/>
-          <w:bCs/>
-        </w:rPr>
-        <w:t xml:space="preserve">) window will open. Wait for the rocket icon to appear in the </w:t>
-      </w:r>
-      <w:proofErr w:type="spellStart"/>
-      <w:r>
-        <w:rPr>
-          <w:rFonts w:cs="Times New Roman"/>
-          <w:bCs/>
-        </w:rPr>
-        <w:t>cmd</w:t>
-      </w:r>
-      <w:proofErr w:type="spellEnd"/>
-      <w:r>
-        <w:rPr>
-          <w:rFonts w:cs="Times New Roman"/>
-          <w:bCs/>
-        </w:rPr>
-        <w:t xml:space="preserve"> window, then press F5 to refresh the webpage.</w:t>
+        <w:t>To use the Trace Viewer, click the trace_viewer2.0.bat file on your Desktop. A webpage and a command prompt (cmd) window will open. Wait for the rocket icon to appear in the cmd window, then press F5 to refresh the webpage.</w:t>
       </w:r>
     </w:p>
     <w:p>
@@ -3151,21 +2980,7 @@
         <w:rPr>
           <w:rFonts w:ascii="Times New Roman" w:hAnsi="Times New Roman" w:cs="Times New Roman"/>
         </w:rPr>
-        <w:t xml:space="preserve"> tab is set as the default (this is the most important part of the viewer). Paste your </w:t>
-      </w:r>
-      <w:proofErr w:type="spellStart"/>
-      <w:r>
-        <w:rPr>
-          <w:rFonts w:ascii="Times New Roman" w:hAnsi="Times New Roman" w:cs="Times New Roman"/>
-        </w:rPr>
-        <w:t>data.npz</w:t>
-      </w:r>
-      <w:proofErr w:type="spellEnd"/>
-      <w:r>
-        <w:rPr>
-          <w:rFonts w:ascii="Times New Roman" w:hAnsi="Times New Roman" w:cs="Times New Roman"/>
-        </w:rPr>
-        <w:t xml:space="preserve"> file path into </w:t>
+        <w:t xml:space="preserve"> tab is set as the default (this is the most important part of the viewer). Paste your data.npz file path into </w:t>
       </w:r>
       <w:r>
         <w:rPr>
@@ -3273,7 +3088,6 @@
         </w:rPr>
         <w:t xml:space="preserve">). </w:t>
       </w:r>
-      <w:proofErr w:type="spellStart"/>
       <w:r>
         <w:rPr>
           <w:rFonts w:ascii="Times New Roman" w:hAnsi="Times New Roman" w:cs="Times New Roman"/>
@@ -3282,42 +3096,12 @@
         </w:rPr>
         <w:t>Tot_B</w:t>
       </w:r>
-      <w:proofErr w:type="spellEnd"/>
-      <w:r>
-        <w:rPr>
-          <w:rFonts w:ascii="Times New Roman" w:hAnsi="Times New Roman" w:cs="Times New Roman"/>
-        </w:rPr>
-        <w:t xml:space="preserve"> represents the combined intensity of all 'b' excitations (bb + </w:t>
-      </w:r>
-      <w:proofErr w:type="spellStart"/>
-      <w:r>
-        <w:rPr>
-          <w:rFonts w:ascii="Times New Roman" w:hAnsi="Times New Roman" w:cs="Times New Roman"/>
-        </w:rPr>
-        <w:t>bg</w:t>
-      </w:r>
-      <w:proofErr w:type="spellEnd"/>
-      <w:r>
-        <w:rPr>
-          <w:rFonts w:ascii="Times New Roman" w:hAnsi="Times New Roman" w:cs="Times New Roman"/>
-        </w:rPr>
-        <w:t xml:space="preserve"> + </w:t>
-      </w:r>
-      <w:proofErr w:type="spellStart"/>
-      <w:r>
-        <w:rPr>
-          <w:rFonts w:ascii="Times New Roman" w:hAnsi="Times New Roman" w:cs="Times New Roman"/>
-        </w:rPr>
-        <w:t>br</w:t>
-      </w:r>
-      <w:proofErr w:type="spellEnd"/>
-      <w:r>
-        <w:rPr>
-          <w:rFonts w:ascii="Times New Roman" w:hAnsi="Times New Roman" w:cs="Times New Roman"/>
-        </w:rPr>
-        <w:t xml:space="preserve">). </w:t>
-      </w:r>
-      <w:proofErr w:type="spellStart"/>
+      <w:r>
+        <w:rPr>
+          <w:rFonts w:ascii="Times New Roman" w:hAnsi="Times New Roman" w:cs="Times New Roman"/>
+        </w:rPr>
+        <w:t xml:space="preserve"> represents the combined intensity of all 'b' excitations (bb + bg + br). </w:t>
+      </w:r>
       <w:r>
         <w:rPr>
           <w:rFonts w:ascii="Times New Roman" w:hAnsi="Times New Roman" w:cs="Times New Roman"/>
@@ -3326,7 +3110,6 @@
         </w:rPr>
         <w:t>Tot_G</w:t>
       </w:r>
-      <w:proofErr w:type="spellEnd"/>
       <w:r>
         <w:rPr>
           <w:rFonts w:ascii="Times New Roman" w:hAnsi="Times New Roman" w:cs="Times New Roman"/>
@@ -3406,15 +3189,7 @@
         <w:ind w:leftChars="0"/>
       </w:pPr>
       <w:r>
-        <w:t>Fix window average (</w:t>
-      </w:r>
-      <w:proofErr w:type="spellStart"/>
-      <w:r>
-        <w:t>Strided</w:t>
-      </w:r>
-      <w:proofErr w:type="spellEnd"/>
-      <w:r>
-        <w:t xml:space="preserve"> average)</w:t>
+        <w:t>Fix window average (Strided average)</w:t>
       </w:r>
     </w:p>
     <w:p>
@@ -3453,23 +3228,7 @@
         <w:ind w:leftChars="0"/>
       </w:pPr>
       <w:r>
-        <w:t xml:space="preserve">Sliding window </w:t>
-      </w:r>
-      <w:proofErr w:type="spellStart"/>
-      <w:r>
-        <w:t>Savgol</w:t>
-      </w:r>
-      <w:proofErr w:type="spellEnd"/>
-      <w:r>
-        <w:t xml:space="preserve"> (</w:t>
-      </w:r>
-      <w:proofErr w:type="spellStart"/>
-      <w:r>
-        <w:t>Savgol</w:t>
-      </w:r>
-      <w:proofErr w:type="spellEnd"/>
-      <w:r>
-        <w:t>)</w:t>
+        <w:t>Sliding window Savgol (Savgol)</w:t>
       </w:r>
     </w:p>
     <w:p>
@@ -3479,13 +3238,8 @@
         </w:rPr>
         <w:t xml:space="preserve">(Hint: if you need more understanding, view the smoothing.py in </w:t>
       </w:r>
-      <w:proofErr w:type="spellStart"/>
-      <w:r>
-        <w:t>Trace_viewer</w:t>
-      </w:r>
-      <w:proofErr w:type="spellEnd"/>
-      <w:r>
-        <w:t>\utils</w:t>
+      <w:r>
+        <w:t>Trace_viewer\utils</w:t>
       </w:r>
       <w:r>
         <w:rPr>
@@ -3720,21 +3474,7 @@
         <w:rPr>
           <w:rFonts w:ascii="Times New Roman" w:hAnsi="Times New Roman" w:cs="Times New Roman"/>
         </w:rPr>
-        <w:t xml:space="preserve"> keys). This maps to the </w:t>
-      </w:r>
-      <w:proofErr w:type="spellStart"/>
-      <w:r>
-        <w:rPr>
-          <w:rFonts w:ascii="Times New Roman" w:hAnsi="Times New Roman" w:cs="Times New Roman"/>
-        </w:rPr>
-        <w:t>selected_g.npz</w:t>
-      </w:r>
-      <w:proofErr w:type="spellEnd"/>
-      <w:r>
-        <w:rPr>
-          <w:rFonts w:ascii="Times New Roman" w:hAnsi="Times New Roman" w:cs="Times New Roman"/>
-        </w:rPr>
-        <w:t xml:space="preserve"> file: +1 (Good/Green), -1 (Bad/Red), or 0 (Unmarked/No color). </w:t>
+        <w:t xml:space="preserve"> keys). This maps to the selected_g.npz file: +1 (Good/Green), -1 (Bad/Red), or 0 (Unmarked/No color). </w:t>
       </w:r>
       <w:r>
         <w:rPr>
@@ -4124,21 +3864,7 @@
         <w:rPr>
           <w:rFonts w:ascii="Times New Roman" w:hAnsi="Times New Roman" w:cs="Times New Roman"/>
         </w:rPr>
-        <w:t xml:space="preserve"> Toggles a separate colocalized flag for the current trace (saved alongside </w:t>
-      </w:r>
-      <w:proofErr w:type="spellStart"/>
-      <w:r>
-        <w:rPr>
-          <w:rFonts w:ascii="Times New Roman" w:hAnsi="Times New Roman" w:cs="Times New Roman"/>
-        </w:rPr>
-        <w:t>selected_g</w:t>
-      </w:r>
-      <w:proofErr w:type="spellEnd"/>
-      <w:r>
-        <w:rPr>
-          <w:rFonts w:ascii="Times New Roman" w:hAnsi="Times New Roman" w:cs="Times New Roman"/>
-        </w:rPr>
-        <w:t xml:space="preserve"> when you press </w:t>
+        <w:t xml:space="preserve"> Toggles a separate colocalized flag for the current trace (saved alongside selected_g when you press </w:t>
       </w:r>
       <w:r>
         <w:rPr>
@@ -4211,21 +3937,7 @@
         <w:rPr>
           <w:rFonts w:ascii="Times New Roman" w:hAnsi="Times New Roman" w:cs="Times New Roman"/>
         </w:rPr>
-        <w:t xml:space="preserve"> Writes all breakpoint data to </w:t>
-      </w:r>
-      <w:proofErr w:type="spellStart"/>
-      <w:r>
-        <w:rPr>
-          <w:rFonts w:ascii="Times New Roman" w:hAnsi="Times New Roman" w:cs="Times New Roman"/>
-        </w:rPr>
-        <w:t>breakpoints.npz</w:t>
-      </w:r>
-      <w:proofErr w:type="spellEnd"/>
-      <w:r>
-        <w:rPr>
-          <w:rFonts w:ascii="Times New Roman" w:hAnsi="Times New Roman" w:cs="Times New Roman"/>
-        </w:rPr>
-        <w:t xml:space="preserve"> (the previous file is backed up with a timestamp).</w:t>
+        <w:t xml:space="preserve"> Writes all breakpoint data to breakpoints.npz (the previous file is backed up with a timestamp).</w:t>
       </w:r>
     </w:p>
     <w:p>
@@ -4252,21 +3964,7 @@
         <w:rPr>
           <w:rFonts w:ascii="Times New Roman" w:hAnsi="Times New Roman" w:cs="Times New Roman"/>
         </w:rPr>
-        <w:t xml:space="preserve"> Reloads </w:t>
-      </w:r>
-      <w:proofErr w:type="spellStart"/>
-      <w:r>
-        <w:rPr>
-          <w:rFonts w:ascii="Times New Roman" w:hAnsi="Times New Roman" w:cs="Times New Roman"/>
-        </w:rPr>
-        <w:t>breakpoints.npz</w:t>
-      </w:r>
-      <w:proofErr w:type="spellEnd"/>
-      <w:r>
-        <w:rPr>
-          <w:rFonts w:ascii="Times New Roman" w:hAnsi="Times New Roman" w:cs="Times New Roman"/>
-        </w:rPr>
-        <w:t xml:space="preserve"> into memory.</w:t>
+        <w:t xml:space="preserve"> Reloads breakpoints.npz into memory.</w:t>
       </w:r>
     </w:p>
     <w:p>
@@ -4348,45 +4046,13 @@
           <w:b/>
           <w:bCs/>
         </w:rPr>
-        <w:t xml:space="preserve">Plot </w:t>
-      </w:r>
-      <w:proofErr w:type="spellStart"/>
-      <w:r>
-        <w:rPr>
-          <w:rFonts w:ascii="Times New Roman" w:hAnsi="Times New Roman" w:cs="Times New Roman"/>
-          <w:b/>
-          <w:bCs/>
-        </w:rPr>
-        <w:t>FRET_g</w:t>
-      </w:r>
-      <w:proofErr w:type="spellEnd"/>
-      <w:r>
-        <w:rPr>
-          <w:rFonts w:ascii="Times New Roman" w:hAnsi="Times New Roman" w:cs="Times New Roman"/>
-          <w:b/>
-          <w:bCs/>
-        </w:rPr>
-        <w:t>:</w:t>
-      </w:r>
-      <w:r>
-        <w:rPr>
-          <w:rFonts w:ascii="Times New Roman" w:hAnsi="Times New Roman" w:cs="Times New Roman"/>
-        </w:rPr>
-        <w:t xml:space="preserve"> Batch-plots every trace's </w:t>
-      </w:r>
-      <w:proofErr w:type="spellStart"/>
-      <w:r>
-        <w:rPr>
-          <w:rFonts w:ascii="Times New Roman" w:hAnsi="Times New Roman" w:cs="Times New Roman"/>
-        </w:rPr>
-        <w:t>fret_g</w:t>
-      </w:r>
-      <w:proofErr w:type="spellEnd"/>
-      <w:r>
-        <w:rPr>
-          <w:rFonts w:ascii="Times New Roman" w:hAnsi="Times New Roman" w:cs="Times New Roman"/>
-        </w:rPr>
-        <w:t xml:space="preserve"> curve into PNG files for a dataset overview.</w:t>
+        <w:t>Plot FRET_g:</w:t>
+      </w:r>
+      <w:r>
+        <w:rPr>
+          <w:rFonts w:ascii="Times New Roman" w:hAnsi="Times New Roman" w:cs="Times New Roman"/>
+        </w:rPr>
+        <w:t xml:space="preserve"> Batch-plots every trace's fret_g curve into PNG files for a dataset overview.</w:t>
       </w:r>
     </w:p>
     <w:p>
@@ -4448,7 +4114,6 @@
         </w:rPr>
         <w:t xml:space="preserve">Press </w:t>
       </w:r>
-      <w:proofErr w:type="spellStart"/>
       <w:r>
         <w:rPr>
           <w:rFonts w:ascii="Times New Roman" w:hAnsi="Times New Roman" w:cs="Times New Roman"/>
@@ -4457,7 +4122,6 @@
         </w:rPr>
         <w:t>Ctrl+Z</w:t>
       </w:r>
-      <w:proofErr w:type="spellEnd"/>
       <w:r>
         <w:rPr>
           <w:rFonts w:ascii="Times New Roman" w:hAnsi="Times New Roman" w:cs="Times New Roman"/>
@@ -4481,21 +4145,7 @@
         <w:rPr>
           <w:rFonts w:ascii="Times New Roman" w:hAnsi="Times New Roman" w:cs="Times New Roman"/>
         </w:rPr>
-        <w:t xml:space="preserve">On the Tools, </w:t>
-      </w:r>
-      <w:proofErr w:type="spellStart"/>
-      <w:r>
-        <w:rPr>
-          <w:rFonts w:ascii="Times New Roman" w:hAnsi="Times New Roman" w:cs="Times New Roman"/>
-        </w:rPr>
-        <w:t>Aois</w:t>
-      </w:r>
-      <w:proofErr w:type="spellEnd"/>
-      <w:r>
-        <w:rPr>
-          <w:rFonts w:ascii="Times New Roman" w:hAnsi="Times New Roman" w:cs="Times New Roman"/>
-        </w:rPr>
-        <w:t>, and GMM tabs, it reverts breakpoint edits (Add/Remove, Set Dead/End, Clear/Set All, Auto-Find).</w:t>
+        <w:t>On the Tools, Aois, and GMM tabs, it reverts breakpoint edits (Add/Remove, Set Dead/End, Clear/Set All, Auto-Find).</w:t>
       </w:r>
     </w:p>
     <w:p>
@@ -4541,35 +4191,7 @@
         <w:rPr>
           <w:rFonts w:ascii="Times New Roman" w:hAnsi="Times New Roman" w:cs="Times New Roman"/>
         </w:rPr>
-        <w:t xml:space="preserve"> The history depth is 5 steps. The Rupture tab does not support </w:t>
-      </w:r>
-      <w:proofErr w:type="spellStart"/>
-      <w:r>
-        <w:rPr>
-          <w:rFonts w:ascii="Times New Roman" w:hAnsi="Times New Roman" w:cs="Times New Roman"/>
-        </w:rPr>
-        <w:t>Ctrl+Z</w:t>
-      </w:r>
-      <w:proofErr w:type="spellEnd"/>
-      <w:r>
-        <w:rPr>
-          <w:rFonts w:ascii="Times New Roman" w:hAnsi="Times New Roman" w:cs="Times New Roman"/>
-        </w:rPr>
-        <w:t xml:space="preserve"> (use its Clear buttons). Good/Bad marking (z/x keys) is never affected by </w:t>
-      </w:r>
-      <w:proofErr w:type="spellStart"/>
-      <w:r>
-        <w:rPr>
-          <w:rFonts w:ascii="Times New Roman" w:hAnsi="Times New Roman" w:cs="Times New Roman"/>
-        </w:rPr>
-        <w:t>Ctrl+Z</w:t>
-      </w:r>
-      <w:proofErr w:type="spellEnd"/>
-      <w:r>
-        <w:rPr>
-          <w:rFonts w:ascii="Times New Roman" w:hAnsi="Times New Roman" w:cs="Times New Roman"/>
-        </w:rPr>
-        <w:t>.</w:t>
+        <w:t xml:space="preserve"> The history depth is 5 steps. The Rupture tab does not support Ctrl+Z (use its Clear buttons). Good/Bad marking (z/x keys) is never affected by Ctrl+Z.</w:t>
       </w:r>
     </w:p>
     <w:p>
@@ -4583,14 +4205,12 @@
           <w:rFonts w:ascii="Times New Roman" w:hAnsi="Times New Roman" w:cs="Times New Roman"/>
         </w:rPr>
       </w:pPr>
-      <w:proofErr w:type="spellStart"/>
       <w:r>
         <w:rPr>
           <w:rFonts w:ascii="Times New Roman" w:hAnsi="Times New Roman" w:cs="Times New Roman" w:hint="eastAsia"/>
         </w:rPr>
         <w:t>Aois</w:t>
       </w:r>
-      <w:proofErr w:type="spellEnd"/>
       <w:r>
         <w:rPr>
           <w:rFonts w:ascii="Times New Roman" w:hAnsi="Times New Roman" w:cs="Times New Roman"/>
@@ -4833,43 +4453,19 @@
         </w:rPr>
         <w:t xml:space="preserve"> (only fits 'Good' traces), or apply the </w:t>
       </w:r>
-      <w:proofErr w:type="spellStart"/>
-      <w:r>
-        <w:rPr>
-          <w:rFonts w:ascii="Times New Roman" w:hAnsi="Times New Roman" w:cs="Times New Roman"/>
-          <w:b/>
-          <w:bCs/>
-        </w:rPr>
-        <w:t>Photobleach</w:t>
-      </w:r>
-      <w:proofErr w:type="spellEnd"/>
-      <w:r>
-        <w:rPr>
-          <w:rFonts w:ascii="Times New Roman" w:hAnsi="Times New Roman" w:cs="Times New Roman"/>
-          <w:b/>
-          <w:bCs/>
-        </w:rPr>
-        <w:t xml:space="preserve"> Filter</w:t>
-      </w:r>
-      <w:r>
-        <w:rPr>
-          <w:rFonts w:ascii="Times New Roman" w:hAnsi="Times New Roman" w:cs="Times New Roman"/>
-        </w:rPr>
-        <w:t xml:space="preserve"> (truncates the fit at the </w:t>
-      </w:r>
-      <w:proofErr w:type="spellStart"/>
-      <w:r>
-        <w:rPr>
-          <w:rFonts w:ascii="Times New Roman" w:hAnsi="Times New Roman" w:cs="Times New Roman"/>
-        </w:rPr>
-        <w:t>photobleach</w:t>
-      </w:r>
-      <w:proofErr w:type="spellEnd"/>
-      <w:r>
-        <w:rPr>
-          <w:rFonts w:ascii="Times New Roman" w:hAnsi="Times New Roman" w:cs="Times New Roman"/>
-        </w:rPr>
-        <w:t xml:space="preserve"> frame based on intensity). Press </w:t>
+      <w:r>
+        <w:rPr>
+          <w:rFonts w:ascii="Times New Roman" w:hAnsi="Times New Roman" w:cs="Times New Roman"/>
+          <w:b/>
+          <w:bCs/>
+        </w:rPr>
+        <w:t>Photobleach Filter</w:t>
+      </w:r>
+      <w:r>
+        <w:rPr>
+          <w:rFonts w:ascii="Times New Roman" w:hAnsi="Times New Roman" w:cs="Times New Roman"/>
+        </w:rPr>
+        <w:t xml:space="preserve"> (truncates the fit at the photobleach frame based on intensity). Press </w:t>
       </w:r>
       <w:r>
         <w:rPr>
@@ -4946,21 +4542,7 @@
         <w:rPr>
           <w:rFonts w:ascii="Times New Roman" w:hAnsi="Times New Roman" w:cs="Times New Roman"/>
         </w:rPr>
-        <w:t xml:space="preserve"> to fit. Use the Save/Load buttons to manage your </w:t>
-      </w:r>
-      <w:proofErr w:type="spellStart"/>
-      <w:r>
-        <w:rPr>
-          <w:rFonts w:ascii="Times New Roman" w:hAnsi="Times New Roman" w:cs="Times New Roman"/>
-        </w:rPr>
-        <w:t>hmm.npz</w:t>
-      </w:r>
-      <w:proofErr w:type="spellEnd"/>
-      <w:r>
-        <w:rPr>
-          <w:rFonts w:ascii="Times New Roman" w:hAnsi="Times New Roman" w:cs="Times New Roman"/>
-        </w:rPr>
-        <w:t xml:space="preserve"> prediction files and transition counts.</w:t>
+        <w:t xml:space="preserve"> to fit. Use the Save/Load buttons to manage your hmm.npz prediction files and transition counts.</w:t>
       </w:r>
     </w:p>
     <w:p>
@@ -5040,21 +4622,7 @@
         <w:rPr>
           <w:rFonts w:ascii="Times New Roman" w:hAnsi="Times New Roman" w:cs="Times New Roman"/>
         </w:rPr>
-        <w:t xml:space="preserve"> to run a fresh fit (saves a new </w:t>
-      </w:r>
-      <w:proofErr w:type="spellStart"/>
-      <w:r>
-        <w:rPr>
-          <w:rFonts w:ascii="Times New Roman" w:hAnsi="Times New Roman" w:cs="Times New Roman"/>
-        </w:rPr>
-        <w:t>model.pkl</w:t>
-      </w:r>
-      <w:proofErr w:type="spellEnd"/>
-      <w:r>
-        <w:rPr>
-          <w:rFonts w:ascii="Times New Roman" w:hAnsi="Times New Roman" w:cs="Times New Roman"/>
-        </w:rPr>
-        <w:t xml:space="preserve">). Turn </w:t>
+        <w:t xml:space="preserve"> to run a fresh fit (saves a new model.pkl). Turn </w:t>
       </w:r>
       <w:r>
         <w:rPr>
@@ -5110,7 +4678,20 @@
           <w:rFonts w:ascii="Times New Roman" w:hAnsi="Times New Roman" w:cs="Times New Roman"/>
         </w:rPr>
       </w:pPr>
-      <w:proofErr w:type="spellStart"/>
+      <w:r>
+        <w:rPr>
+          <w:rFonts w:ascii="Times New Roman" w:hAnsi="Times New Roman" w:cs="Times New Roman"/>
+          <w:b/>
+          <w:bCs/>
+        </w:rPr>
+        <w:t>n_iter &amp; Epoch:</w:t>
+      </w:r>
+      <w:r>
+        <w:rPr>
+          <w:rFonts w:ascii="Times New Roman" w:hAnsi="Times New Roman" w:cs="Times New Roman"/>
+        </w:rPr>
+        <w:t xml:space="preserve"> Set </w:t>
+      </w:r>
       <w:r>
         <w:rPr>
           <w:rFonts w:ascii="Times New Roman" w:hAnsi="Times New Roman" w:cs="Times New Roman"/>
@@ -5119,31 +4700,6 @@
         </w:rPr>
         <w:t>n_iter</w:t>
       </w:r>
-      <w:proofErr w:type="spellEnd"/>
-      <w:r>
-        <w:rPr>
-          <w:rFonts w:ascii="Times New Roman" w:hAnsi="Times New Roman" w:cs="Times New Roman"/>
-          <w:b/>
-          <w:bCs/>
-        </w:rPr>
-        <w:t xml:space="preserve"> &amp; Epoch:</w:t>
-      </w:r>
-      <w:r>
-        <w:rPr>
-          <w:rFonts w:ascii="Times New Roman" w:hAnsi="Times New Roman" w:cs="Times New Roman"/>
-        </w:rPr>
-        <w:t xml:space="preserve"> Set </w:t>
-      </w:r>
-      <w:proofErr w:type="spellStart"/>
-      <w:r>
-        <w:rPr>
-          <w:rFonts w:ascii="Times New Roman" w:hAnsi="Times New Roman" w:cs="Times New Roman"/>
-          <w:b/>
-          <w:bCs/>
-        </w:rPr>
-        <w:t>n_iter</w:t>
-      </w:r>
-      <w:proofErr w:type="spellEnd"/>
       <w:r>
         <w:rPr>
           <w:rFonts w:ascii="Times New Roman" w:hAnsi="Times New Roman" w:cs="Times New Roman"/>
@@ -5235,7 +4791,6 @@
         </w:rPr>
         <w:t xml:space="preserve">f you fit with intensity data </w:t>
       </w:r>
-      <w:proofErr w:type="spellStart"/>
       <w:r>
         <w:rPr>
           <w:rFonts w:ascii="Times New Roman" w:hAnsi="Times New Roman" w:cs="Times New Roman" w:hint="eastAsia"/>
@@ -5244,7 +4799,6 @@
         </w:rPr>
         <w:t>diag</w:t>
       </w:r>
-      <w:proofErr w:type="spellEnd"/>
       <w:r>
         <w:rPr>
           <w:rFonts w:ascii="Times New Roman" w:hAnsi="Times New Roman" w:cs="Times New Roman" w:hint="eastAsia"/>
@@ -5847,45 +5401,13 @@
           <w:b/>
           <w:bCs/>
         </w:rPr>
-        <w:t xml:space="preserve">Save </w:t>
-      </w:r>
-      <w:proofErr w:type="spellStart"/>
-      <w:r>
-        <w:rPr>
-          <w:rFonts w:ascii="Times New Roman" w:hAnsi="Times New Roman" w:cs="Times New Roman"/>
-          <w:b/>
-          <w:bCs/>
-        </w:rPr>
-        <w:t>Dwell.npz</w:t>
-      </w:r>
-      <w:proofErr w:type="spellEnd"/>
-      <w:r>
-        <w:rPr>
-          <w:rFonts w:ascii="Times New Roman" w:hAnsi="Times New Roman" w:cs="Times New Roman"/>
-          <w:b/>
-          <w:bCs/>
-        </w:rPr>
-        <w:t>:</w:t>
-      </w:r>
-      <w:r>
-        <w:rPr>
-          <w:rFonts w:ascii="Times New Roman" w:hAnsi="Times New Roman" w:cs="Times New Roman"/>
-        </w:rPr>
-        <w:t xml:space="preserve"> Applies your cuts, calculates the valid dwell durations in seconds, and saves them to </w:t>
-      </w:r>
-      <w:proofErr w:type="spellStart"/>
-      <w:r>
-        <w:rPr>
-          <w:rFonts w:ascii="Times New Roman" w:hAnsi="Times New Roman" w:cs="Times New Roman"/>
-        </w:rPr>
-        <w:t>dwell.npz</w:t>
-      </w:r>
-      <w:proofErr w:type="spellEnd"/>
-      <w:r>
-        <w:rPr>
-          <w:rFonts w:ascii="Times New Roman" w:hAnsi="Times New Roman" w:cs="Times New Roman"/>
-        </w:rPr>
-        <w:t>.</w:t>
+        <w:t>Save Dwell.npz:</w:t>
+      </w:r>
+      <w:r>
+        <w:rPr>
+          <w:rFonts w:ascii="Times New Roman" w:hAnsi="Times New Roman" w:cs="Times New Roman"/>
+        </w:rPr>
+        <w:t xml:space="preserve"> Applies your cuts, calculates the valid dwell durations in seconds, and saves them to dwell.npz.</w:t>
       </w:r>
     </w:p>
     <w:p>
@@ -6336,21 +5858,7 @@
         <w:rPr>
           <w:rFonts w:ascii="Times New Roman" w:hAnsi="Times New Roman" w:cs="Times New Roman"/>
         </w:rPr>
-        <w:t xml:space="preserve"> breakpoints on a trace that already has previously saved breakpoints (from an older </w:t>
-      </w:r>
-      <w:proofErr w:type="spellStart"/>
-      <w:r>
-        <w:rPr>
-          <w:rFonts w:ascii="Times New Roman" w:hAnsi="Times New Roman" w:cs="Times New Roman"/>
-        </w:rPr>
-        <w:t>breakpoints.npz</w:t>
-      </w:r>
-      <w:proofErr w:type="spellEnd"/>
-      <w:r>
-        <w:rPr>
-          <w:rFonts w:ascii="Times New Roman" w:hAnsi="Times New Roman" w:cs="Times New Roman"/>
-        </w:rPr>
-        <w:t xml:space="preserve"> file).</w:t>
+        <w:t xml:space="preserve"> breakpoints on a trace that already has previously saved breakpoints (from an older breakpoints.npz file).</w:t>
       </w:r>
     </w:p>
     <w:p>
@@ -6779,103 +6287,61 @@
         <w:rPr>
           <w:rFonts w:ascii="Times New Roman" w:hAnsi="Times New Roman" w:cs="Times New Roman" w:hint="eastAsia"/>
         </w:rPr>
-        <w:t xml:space="preserve"> event (</w:t>
-      </w:r>
-      <w:proofErr w:type="spellStart"/>
+        <w:t xml:space="preserve"> event (ie: photobleach). </w:t>
+      </w:r>
+      <w:r>
+        <w:rPr>
+          <w:rFonts w:ascii="Times New Roman" w:hAnsi="Times New Roman" w:cs="Times New Roman"/>
+        </w:rPr>
+        <w:t>I</w:t>
+      </w:r>
       <w:r>
         <w:rPr>
           <w:rFonts w:ascii="Times New Roman" w:hAnsi="Times New Roman" w:cs="Times New Roman" w:hint="eastAsia"/>
         </w:rPr>
-        <w:t>ie</w:t>
-      </w:r>
-      <w:proofErr w:type="spellEnd"/>
+        <w:t xml:space="preserve">f you need </w:t>
+      </w:r>
+      <w:r>
+        <w:rPr>
+          <w:rFonts w:ascii="Times New Roman" w:hAnsi="Times New Roman" w:cs="Times New Roman"/>
+        </w:rPr>
+        <w:t>“</w:t>
+      </w:r>
       <w:r>
         <w:rPr>
           <w:rFonts w:ascii="Times New Roman" w:hAnsi="Times New Roman" w:cs="Times New Roman" w:hint="eastAsia"/>
         </w:rPr>
-        <w:t xml:space="preserve">: </w:t>
-      </w:r>
-      <w:proofErr w:type="spellStart"/>
+        <w:t>upward</w:t>
+      </w:r>
+      <w:r>
+        <w:rPr>
+          <w:rFonts w:ascii="Times New Roman" w:hAnsi="Times New Roman" w:cs="Times New Roman"/>
+        </w:rPr>
+        <w:t>”</w:t>
+      </w:r>
       <w:r>
         <w:rPr>
           <w:rFonts w:ascii="Times New Roman" w:hAnsi="Times New Roman" w:cs="Times New Roman" w:hint="eastAsia"/>
         </w:rPr>
-        <w:t>photobleach</w:t>
-      </w:r>
-      <w:proofErr w:type="spellEnd"/>
+        <w:t xml:space="preserve"> logic. </w:t>
+      </w:r>
+      <w:r>
+        <w:rPr>
+          <w:rFonts w:ascii="Segoe UI Emoji" w:hAnsi="Segoe UI Emoji" w:cs="Segoe UI Emoji"/>
+        </w:rPr>
+        <w:t>🐎</w:t>
+      </w:r>
+      <w:r>
+        <w:rPr>
+          <w:rFonts w:ascii="Times New Roman" w:hAnsi="Times New Roman" w:cs="Times New Roman"/>
+        </w:rPr>
+        <w:t xml:space="preserve"> said add by yourself</w:t>
+      </w:r>
       <w:r>
         <w:rPr>
           <w:rFonts w:ascii="Times New Roman" w:hAnsi="Times New Roman" w:cs="Times New Roman" w:hint="eastAsia"/>
         </w:rPr>
-        <w:t xml:space="preserve">). </w:t>
-      </w:r>
-      <w:r>
-        <w:rPr>
-          <w:rFonts w:ascii="Times New Roman" w:hAnsi="Times New Roman" w:cs="Times New Roman"/>
-        </w:rPr>
-        <w:t>I</w:t>
-      </w:r>
-      <w:r>
-        <w:rPr>
-          <w:rFonts w:ascii="Times New Roman" w:hAnsi="Times New Roman" w:cs="Times New Roman" w:hint="eastAsia"/>
-        </w:rPr>
-        <w:t xml:space="preserve">f you need </w:t>
-      </w:r>
-      <w:r>
-        <w:rPr>
-          <w:rFonts w:ascii="Times New Roman" w:hAnsi="Times New Roman" w:cs="Times New Roman"/>
-        </w:rPr>
-        <w:t>“</w:t>
-      </w:r>
-      <w:r>
-        <w:rPr>
-          <w:rFonts w:ascii="Times New Roman" w:hAnsi="Times New Roman" w:cs="Times New Roman" w:hint="eastAsia"/>
-        </w:rPr>
-        <w:t>upward</w:t>
-      </w:r>
-      <w:r>
-        <w:rPr>
-          <w:rFonts w:ascii="Times New Roman" w:hAnsi="Times New Roman" w:cs="Times New Roman"/>
-        </w:rPr>
-        <w:t>”</w:t>
-      </w:r>
-      <w:r>
-        <w:rPr>
-          <w:rFonts w:ascii="Times New Roman" w:hAnsi="Times New Roman" w:cs="Times New Roman" w:hint="eastAsia"/>
-        </w:rPr>
-        <w:t xml:space="preserve"> logic. </w:t>
-      </w:r>
-      <w:r>
-        <w:rPr>
-          <w:rFonts w:ascii="Segoe UI Emoji" w:hAnsi="Segoe UI Emoji" w:cs="Segoe UI Emoji"/>
-        </w:rPr>
-        <w:t>🐎</w:t>
-      </w:r>
-      <w:r>
-        <w:rPr>
-          <w:rFonts w:ascii="Times New Roman" w:hAnsi="Times New Roman" w:cs="Times New Roman"/>
-        </w:rPr>
-        <w:t xml:space="preserve"> said add by yourself</w:t>
-      </w:r>
-      <w:r>
-        <w:rPr>
-          <w:rFonts w:ascii="Times New Roman" w:hAnsi="Times New Roman" w:cs="Times New Roman" w:hint="eastAsia"/>
-        </w:rPr>
-        <w:t xml:space="preserve"> and create the </w:t>
-      </w:r>
-      <w:proofErr w:type="spellStart"/>
-      <w:r>
-        <w:rPr>
-          <w:rFonts w:ascii="Times New Roman" w:hAnsi="Times New Roman" w:cs="Times New Roman" w:hint="eastAsia"/>
-        </w:rPr>
-        <w:t>Trace_viewer</w:t>
-      </w:r>
-      <w:proofErr w:type="spellEnd"/>
-      <w:r>
-        <w:rPr>
-          <w:rFonts w:ascii="Times New Roman" w:hAnsi="Times New Roman" w:cs="Times New Roman" w:hint="eastAsia"/>
-        </w:rPr>
-        <w:t xml:space="preserve"> 3.0 !!!!!!!!!!!!</w:t>
+        <w:t xml:space="preserve"> and create the Trace_viewer 3.0 !!!!!!!!!!!!</w:t>
       </w:r>
     </w:p>
     <w:sectPr>

</xml_diff>